<commit_message>
Thuyết minh chi tiết (từng hiện vật): new-tretyakov-gallery, moscow-planetarium, bunker-42 [nhóm C]
Co-Authored-By: Claude Opus 4.8 <noreply@anthropic.com>
Claude-Session: https://claude.ai/code/session_01Ew8z6BZhKhSrKyb5gWwkR8
</commit_message>
<xml_diff>
--- a/tai-lieu-noi-bo/moscow/bunker-42.docx
+++ b/tai-lieu-noi-bo/moscow/bunker-42.docx
@@ -96,6 +96,22 @@
       </w:pPr>
       <w:r>
         <w:t>Sở hữu nhà hàng được quảng bá là sâu nhất Moscow và không gian sự kiện độc đáo dưới lòng đất.</w:t>
+      </w:r>
+    </w:p>
+    <w:p>
+      <w:pPr>
+        <w:pStyle w:val="ListBullet"/>
+      </w:pPr>
+      <w:r>
+        <w:t>Sự thật sau tên gọi 'hầm Stalin': khởi công năm 1951 nhưng hoàn thành và đưa vào dùng năm 1956 — sau khi Stalin qua đời (1953); vốn là sở chỉ huy dự phòng của lực lượng Phòng không / Không quân Tầm xa, không phải hầm riêng của Stalin.</w:t>
+      </w:r>
+    </w:p>
+    <w:p>
+      <w:pPr>
+        <w:pStyle w:val="ListBullet"/>
+      </w:pPr>
+      <w:r>
+        <w:t>Bốn khối hầm hình ống nối thẳng vào ga metro Taganskaya qua hai đường hầm; công trình từng đổi tên nhiều lần: object-02 (1947), CHZ-293 (1951), CHZ-572 (1953), GO-42 (từ 1980).</w:t>
       </w:r>
     </w:p>
     <w:p>
@@ -351,6 +367,100 @@
       </w:pPr>
       <w:r>
         <w:t>Một điểm độc đáo khác là nhà hàng nằm sâu 65 mét dưới lòng đất — được quảng bá là nhà hàng sâu nhất Moscow — cùng không gian tổ chức sự kiện. Nhiều du khách còn tham gia các trò chơi nhập vai, bắn laser hoặc thử đội mặt nạ phòng độc để cảm nhận rõ hơn bối cảnh thời chiến. Tất cả những yếu tố này biến chuyến tham quan thành một trải nghiệm đa giác quan, không chỉ để xem mà còn để cảm.</w:t>
+      </w:r>
+    </w:p>
+    <w:p>
+      <w:pPr>
+        <w:pStyle w:val="Heading1"/>
+      </w:pPr>
+      <w:r>
+        <w:rPr>
+          <w:color w:val="152C4E"/>
+        </w:rPr>
+        <w:t>Đi từng khối hầm — xem gì dưới lòng đất 65 mét</w:t>
+      </w:r>
+    </w:p>
+    <w:p>
+      <w:pPr>
+        <w:jc w:val="both"/>
+      </w:pPr>
+      <w:r>
+        <w:t>Chuyến tham quan bắt đầu ngay từ mặt đất, ở một tòa nhà hai tầng màu vàng khiêm tốn theo lối tân cổ điển trong ngõ Kotelnichesky thứ 5. Trông như một dinh thự cũ bình thường, nhưng thực ra cả tòa nhà chỉ là một chiếc 'nắp' ngụy trang che giếng thông xuống hầm và bảo vệ nó khỏi sóng xung kích. Cách kể mở màn: hỏi khách 'các bạn có tin dưới chân mình là một thành phố ngầm 18 tầng không?' trước khi bước qua cánh cửa thép đầu tiên.</w:t>
+      </w:r>
+    </w:p>
+    <w:p>
+      <w:pPr>
+        <w:jc w:val="both"/>
+      </w:pPr>
+      <w:r>
+        <w:t>Từ đó, khách đi xuống độ sâu 65 mét — tương đương một tòa nhà 18 tầng lộn ngược. Đa số phải tự leo cầu thang xoắn hàng trăm bậc (thang máy rất hạn chế), nên đây cũng là một thử thách thể lực nhẹ. Toàn bộ hầm được đào bằng chính công nghệ làm tàu điện ngầm Moscow đầu thập niên 1950, và nối thẳng với ga metro Taganskaya trên tuyến Vòng qua hai đường hầm — để trong tình huống khẩn cấp, người và thiết bị có thể ra vào bí mật bằng đường tàu điện.</w:t>
+      </w:r>
+    </w:p>
+    <w:p>
+      <w:pPr>
+        <w:jc w:val="both"/>
+      </w:pPr>
+      <w:r>
+        <w:t>Bên dưới là bốn khối hầm hình ống khổng lồ, tổng diện tích khoảng 7.000 m², ốp vỏ thép chịu lực. Đây nguyên là trung tâm liên lạc và sở chỉ huy dự phòng, nơi từ đó có thể phát lệnh cho lực lượng không quân tầm xa nếu Moscow bị tấn công hạt nhân. Đi dọc các hành lang bê tông ngột ngạt, khách lần lượt gặp: phòng liên lạc và điện báo với máy phát tín hiệu Morse cùng những chiếc điện thoại cổ (khách được thử nhấc máy gọi cho nhau), các tấm bản đồ tác chiến và sa bàn, và một 'phòng làm việc của Stalin' được tái dựng để phục vụ kể chuyện.</w:t>
+      </w:r>
+    </w:p>
+    <w:p>
+      <w:pPr>
+        <w:jc w:val="both"/>
+      </w:pPr>
+      <w:r>
+        <w:t>Điểm nhấn được chờ đợi nhất là màn mô phỏng phóng tên lửa hạt nhân: khách ngồi vào vị trí trực ban, nghe còi báo động rú lên, cùng vặn chìa khóa và bấm nút phát lệnh — tất cả tái hiện quy trình 'bấm nút' đầy căng thẳng của thời Chiến tranh Lạnh. Trước hoặc sau đó, khách xem một bộ phim tư liệu ngắn về cuộc chạy đua hạt nhân và những khoảnh khắc bên bờ vực chiến tranh như khủng hoảng tên lửa Cuba năm 1962; nhiều tour còn cho khách thử đội mặt nạ phòng độc và mặc bộ đồ chống hóa học.</w:t>
+      </w:r>
+    </w:p>
+    <w:p>
+      <w:pPr>
+        <w:jc w:val="both"/>
+      </w:pPr>
+      <w:r>
+        <w:t>Cả tổ hợp từng được thiết kế để sống tự chủ: có kho lương thực, kho nhiên liệu, hai giếng khoan lấy nước sạch, máy phát điện diesel và hệ thống lọc – tuần hoàn không khí, đủ nuôi khoảng 600 người sống và làm việc trong 30 ngày mà không cần tiếp tế từ bên ngoài. (Lưu ý cho hướng dẫn viên: một số tài liệu quảng bá phóng đại con số này lên tới vài nghìn người trong nhiều tháng — nên dùng số liệu kiểm chứng được để giữ uy tín với khách.) Ngày nay, dưới hầm còn có một nhà hàng được quảng bá là 'sâu nhất Moscow' và không gian tổ chức sự kiện độc đáo.</w:t>
+      </w:r>
+    </w:p>
+    <w:p>
+      <w:pPr>
+        <w:pStyle w:val="Heading1"/>
+      </w:pPr>
+      <w:r>
+        <w:rPr>
+          <w:color w:val="152C4E"/>
+        </w:rPr>
+        <w:t>Sự thật sau cái tên 'hầm Stalin' &amp; dòng thời gian</w:t>
+      </w:r>
+    </w:p>
+    <w:p>
+      <w:pPr>
+        <w:jc w:val="both"/>
+      </w:pPr>
+      <w:r>
+        <w:t>Nhiều tờ rơi và hãng tour gọi nơi đây là 'hầm Stalin', nhưng hướng dẫn viên nên kể cho khách nghe sự thật thú vị: công trình được khởi công năm 1951 (trong thời kỳ Stalin chủ trương xây dựng các sở chỉ huy ngầm chống bom nguyên tử) nhưng chỉ hoàn thành và đưa vào sử dụng năm 1956 — tức là sau khi Stalin đã qua đời năm 1953. Nói cách khác, gần như chắc chắn Stalin chưa từng đặt chân xuống đây. Chức năng thật của hầm là một sở chỉ huy dự phòng phục vụ lực lượng Phòng không và Không quân Tầm xa, không phải nơi ẩn náu riêng của lãnh tụ; 'phòng Stalin' mà khách thấy chỉ là một gian tái dựng để minh họa cho câu chuyện.</w:t>
+      </w:r>
+    </w:p>
+    <w:p>
+      <w:pPr>
+        <w:jc w:val="both"/>
+      </w:pPr>
+      <w:r>
+        <w:t>Bản thân cái tên của hầm cũng nhiều lần thay đổi theo mức độ bí mật và nhiệm vụ: object-02 (năm 1947), CHZ-293 (1951), CHZ-572 (1953), và cuối cùng là GO-42 (từ năm 1980) — chính con số 42 này về sau trở thành thương hiệu 'Bunker-42'. Trong suốt nhiều thập kỷ, sự tồn tại của nó là tuyệt mật; người dân sống ngay trên đầu cũng không hề hay biết.</w:t>
+      </w:r>
+    </w:p>
+    <w:p>
+      <w:pPr>
+        <w:jc w:val="both"/>
+      </w:pPr>
+      <w:r>
+        <w:t>Dòng thời gian ngắn gọn để hướng dẫn viên dễ nhớ: khởi công 1951 → đi vào hoạt động từ 1956 → được trang bị đầy đủ để chống chiến tranh hạt nhân trong thập niên 1960 → ngừng hoạt động và giải mật năm 1995 → đem đấu giá năm 2006, công ty tư nhân Novik-Servis mua lại với giá 65 triệu rúp → cùng năm 2006 mở cửa thành Bảo tàng Chiến tranh Lạnh như hiện nay.</w:t>
+      </w:r>
+    </w:p>
+    <w:p>
+      <w:pPr>
+        <w:jc w:val="both"/>
+      </w:pPr>
+      <w:r>
+        <w:t>Cách kể cho khách Việt: hãy dồn cảm xúc vào bầu không khí — cái lạnh, tiếng còi, những cánh cửa thép dày — để khách 'thấm' được nỗi ám ảnh của thời hai siêu cường kề nhau bên miệng hố chiến tranh. Đồng thời nhớ dặn trước hai điều thực tế: khách phải tự leo khoảng 18 tầng cầu thang nên hãy đi giày bệt và mang theo áo khoác vì dưới hầm khá lạnh; người sợ không gian kín hoặc sức khỏe yếu nên cân nhắc kỹ trước khi tham gia.</w:t>
       </w:r>
     </w:p>
     <w:p>
@@ -804,6 +914,21 @@
       </w:r>
     </w:p>
     <w:p>
+      <w:r>
+        <w:rPr>
+          <w:sz w:val="22"/>
+        </w:rPr>
+        <w:t xml:space="preserve">• Bridge to Moscow — Soviet Bunker 42 on Taganka — </w:t>
+      </w:r>
+      <w:r>
+        <w:rPr>
+          <w:color w:val="204A86"/>
+          <w:sz w:val="20"/>
+        </w:rPr>
+        <w:t>https://bridgetomoscow.com/secret-soviet-bunker</w:t>
+      </w:r>
+    </w:p>
+    <w:p>
       <w:pPr>
         <w:pStyle w:val="Heading2"/>
       </w:pPr>
@@ -880,11 +1005,38 @@
     <w:p>
       <w:r>
         <w:rPr>
+          <w:color w:val="5C6773"/>
+          <w:sz w:val="20"/>
+        </w:rPr>
+        <w:t>Wikipedia (EN) 'Tagansky Protected Command Point' — khởi công 1951 (đáp lại nguy cơ chiến tranh hạt nhân từ Mỹ), làm trung tâm liên lạc/sở chỉ huy cho Quân khu Phòng không Moscow (PVO) từ 1956; xây bằng công nghệ đào metro và nối metro qua hai đường hầm; sâu 65 m, diện tích khoảng 7.000 m²; nuôi được khoảng 600 người trong 30 ngày nhờ kho lương thực, nhiên liệu, hai giếng khoan, máy phát diesel và hệ tuần hoàn không khí; các mã định danh object-02 (1947), CHZ-293 (1951), CHZ-572 (1953), GO-42 (từ 1980); đấu giá năm 2006, công ty Novik-Servis mua với giá 65 triệu rúp.</w:t>
+      </w:r>
+    </w:p>
+    <w:p>
+      <w:r>
+        <w:rPr>
+          <w:color w:val="5C6773"/>
+          <w:sz w:val="20"/>
+        </w:rPr>
+        <w:t>Rusmania — hầm ngừng hoạt động (giải mật) năm 1995, sau đó chuyển thành Bảo tàng Chiến tranh Lạnh.</w:t>
+      </w:r>
+    </w:p>
+    <w:p>
+      <w:r>
+        <w:rPr>
+          <w:color w:val="5C6773"/>
+          <w:sz w:val="20"/>
+        </w:rPr>
+        <w:t>Lưu ý biên soạn: sức chứa và thời gian tự chủ có sai khác giữa các nguồn (một số trang du lịch nói tới vài nghìn người trong sáu tháng); tài liệu này dùng số liệu kiểm chứng được (~600 người/30 ngày). Tên gọi 'hầm Stalin' mang tính quảng bá — cần nói rõ công trình hoàn thành năm 1956, sau khi Stalin qua đời (1953).</w:t>
+      </w:r>
+    </w:p>
+    <w:p>
+      <w:r>
+        <w:rPr>
           <w:i/>
           <w:color w:val="5C6773"/>
           <w:sz w:val="18"/>
         </w:rPr>
-        <w:t>Tài liệu nội bộ — không dùng cho mục đích public. Biên soạn nguyên gốc, có dẫn nguồn. Cập nhật 2026-08-11.</w:t>
+        <w:t>Tài liệu nội bộ — không dùng cho mục đích public. Biên soạn nguyên gốc, có dẫn nguồn. Cập nhật 2026-09-28.</w:t>
       </w:r>
     </w:p>
     <w:sectPr>

</xml_diff>